<commit_message>
docs: atualizar dossie vivo com a Fase 11 (Redesign Modular do Admin em 4 Pilares)
</commit_message>
<xml_diff>
--- a/public/docs/Netfits_Dossie_Geral_do_Projeto_e_Linha_do_Tempo_Evolutiva.docx
+++ b/public/docs/Netfits_Dossie_Geral_do_Projeto_e_Linha_do_Tempo_Evolutiva.docx
@@ -1110,6 +1110,19 @@
           <w:color w:val="0A0A0C"/>
           <w:sz w:val="20"/>
         </w:rPr>
+        <w:t>│ Fase 11      │ Redesign Modular do Admin (Cockpit em 4 Pilares) &amp; Desacoplamento Público│</w:t>
+      </w:r>
+    </w:p>
+    <w:p>
+      <w:pPr>
+        <w:spacing w:before="40" w:after="60" w:line="276" w:lineRule="auto"/>
+      </w:pPr>
+      <w:r>
+        <w:rPr>
+          <w:rFonts w:ascii="Calibri" w:hAnsi="Calibri"/>
+          <w:color w:val="0A0A0C"/>
+          <w:sz w:val="20"/>
+        </w:rPr>
         <w:t>└──────────────┴──────────────────────────────────────────────────────────────────────────┘</w:t>
       </w:r>
     </w:p>
@@ -1954,6 +1967,115 @@
           <w:sz w:val="20"/>
         </w:rPr>
         <w:t>* Redução de custos de QA de R$ 28.000,00/mês (equipe humana de 3 QAs) para R$ 48,60/mês (com Gemini 2.5 Flash), representando 99,8% de economia FinOps na área de qualidade.</w:t>
+      </w:r>
+    </w:p>
+    <w:p>
+      <w:pPr>
+        <w:spacing w:before="200" w:after="60"/>
+      </w:pPr>
+      <w:r>
+        <w:rPr>
+          <w:rFonts w:ascii="Calibri" w:hAnsi="Calibri"/>
+          <w:b/>
+          <w:color w:val="6EB414"/>
+          <w:sz w:val="21"/>
+        </w:rPr>
+        <w:t>• Fase 11: Redesign Modular do Painel Admin (Cockpit em 4 Pilares) &amp; Desacoplamento de Acesso Público</w:t>
+      </w:r>
+    </w:p>
+    <w:p>
+      <w:pPr>
+        <w:spacing w:before="40" w:after="60" w:line="276" w:lineRule="auto"/>
+        <w:ind w:left="288"/>
+      </w:pPr>
+      <w:r>
+        <w:rPr>
+          <w:rFonts w:ascii="Calibri" w:hAnsi="Calibri"/>
+          <w:color w:val="0A0A0C"/>
+          <w:sz w:val="20"/>
+        </w:rPr>
+        <w:t>* Desacoplamento Rigoroso de Acesso Público: Remoção de qualquer link, botão ou referência à rota /admin nos cabeçalhos institucionais e rodapés das páginas públicas (InstitutionalWebHeader.tsx e home.tsx), garantindo que o painel de controle seja estritamente confidencial e acessível apenas via URL direta protegida por autenticação master.</w:t>
+      </w:r>
+    </w:p>
+    <w:p>
+      <w:pPr>
+        <w:spacing w:before="40" w:after="60" w:line="276" w:lineRule="auto"/>
+        <w:ind w:left="288"/>
+      </w:pPr>
+      <w:r>
+        <w:rPr>
+          <w:rFonts w:ascii="Calibri" w:hAnsi="Calibri"/>
+          <w:color w:val="0A0A0C"/>
+          <w:sz w:val="20"/>
+        </w:rPr>
+        <w:t>* Reestruturação Arquitetural em 4 Pilares de Gestão: Substituição das 14 abas horizontais soltas por uma Sidebar Lateral Modular (Padrão Cockpit Executivo SaaS / Stripe Dashboard) agrupada em:</w:t>
+      </w:r>
+    </w:p>
+    <w:p>
+      <w:pPr>
+        <w:spacing w:before="40" w:after="60" w:line="276" w:lineRule="auto"/>
+        <w:ind w:left="288"/>
+      </w:pPr>
+      <w:r>
+        <w:rPr>
+          <w:rFonts w:ascii="Calibri" w:hAnsi="Calibri"/>
+          <w:color w:val="0A0A0C"/>
+          <w:sz w:val="20"/>
+        </w:rPr>
+        <w:t>1. *Pilar 1: Estratégia &amp; Finanças* (Visão Geral &amp; Cockpit, Resultados &amp; DRE Projetada, Arquivos XML &amp; SPED);</w:t>
+      </w:r>
+    </w:p>
+    <w:p>
+      <w:pPr>
+        <w:spacing w:before="40" w:after="60" w:line="276" w:lineRule="auto"/>
+      </w:pPr>
+      <w:r>
+        <w:rPr>
+          <w:rFonts w:ascii="Calibri" w:hAnsi="Calibri"/>
+          <w:color w:val="0A0A0C"/>
+          <w:sz w:val="20"/>
+        </w:rPr>
+        <w:t>2. *Pilar 2: IA, Tecnologia &amp; QA* (Squad de QA Autônomo 24/7, Controles &amp; FinOps TI, Atividades &amp; Wearables);</w:t>
+      </w:r>
+    </w:p>
+    <w:p>
+      <w:pPr>
+        <w:spacing w:before="40" w:after="60" w:line="276" w:lineRule="auto"/>
+      </w:pPr>
+      <w:r>
+        <w:rPr>
+          <w:rFonts w:ascii="Calibri" w:hAnsi="Calibri"/>
+          <w:color w:val="0A0A0C"/>
+          <w:sz w:val="20"/>
+        </w:rPr>
+        <w:t>3. *Pilar 3: Ecossistema &amp; Usuários* (Base de Usuários com 24 Personas, Gestão de Associados 10% e Parceiros B2B);</w:t>
+      </w:r>
+    </w:p>
+    <w:p>
+      <w:pPr>
+        <w:spacing w:before="40" w:after="60" w:line="276" w:lineRule="auto"/>
+      </w:pPr>
+      <w:r>
+        <w:rPr>
+          <w:rFonts w:ascii="Calibri" w:hAnsi="Calibri"/>
+          <w:color w:val="0A0A0C"/>
+          <w:sz w:val="20"/>
+        </w:rPr>
+        <w:t>4. *Pilar 4: Governança &amp; Operação* (Parâmetros de Negócio, Programa de Pontos nfs, Feed &amp; Retail Media, Marketplace Shop e Central de Interações BI).</w:t>
+      </w:r>
+    </w:p>
+    <w:p>
+      <w:pPr>
+        <w:spacing w:before="40" w:after="60" w:line="276" w:lineRule="auto"/>
+        <w:ind w:left="288"/>
+      </w:pPr>
+      <w:r>
+        <w:rPr>
+          <w:rFonts w:ascii="Calibri" w:hAnsi="Calibri"/>
+          <w:color w:val="0A0A0C"/>
+          <w:sz w:val="20"/>
+        </w:rPr>
+        <w:t>* Otimização Drástica de Usabilidade: Redução da carga cognitiva do gestor, navegação por breadcrumbs contextuais e sub-menus em pills para transição instantânea entre módulos correlatos.</w:t>
       </w:r>
     </w:p>
     <w:p>
@@ -4495,7 +4617,7 @@
         <w:color w:val="8C8C96"/>
         <w:sz w:val="17"/>
       </w:rPr>
-      <w:t>Netfits Ltda. — Dossiê Geral do Projeto &amp; Linha do Tempo Evolutiva (Living Document - Rev. 1.1)</w:t>
+      <w:t>Netfits Ltda. — Dossiê Geral do Projeto &amp; Linha do Tempo Evolutiva (Living Document - Rev. 1.2)</w:t>
     </w:r>
   </w:p>
 </w:ftr>

</xml_diff>

<commit_message>
docs: adicionar Plano Mestre de Prontidao e Lancamento Oficial Netfits (Out/2026 a Jan/2027) no OneDrive
</commit_message>
<xml_diff>
--- a/public/docs/Netfits_Dossie_Geral_do_Projeto_e_Linha_do_Tempo_Evolutiva.docx
+++ b/public/docs/Netfits_Dossie_Geral_do_Projeto_e_Linha_do_Tempo_Evolutiva.docx
@@ -4593,6 +4593,76 @@
         <w:t>*Última atualização: 2 de Setembro de 2026.*</w:t>
       </w:r>
     </w:p>
+    <w:p>
+      <w:pPr>
+        <w:spacing w:before="280" w:after="80"/>
+      </w:pPr>
+      <w:r>
+        <w:rPr>
+          <w:rFonts w:ascii="Calibri" w:hAnsi="Calibri"/>
+          <w:b/>
+          <w:color w:val="7C3AED"/>
+          <w:sz w:val="23"/>
+        </w:rPr>
+        <w:t>SEÇÃO 12: PLANO MESTRE DE PRONTIDÃO OPERACIONAL E LANÇAMENTO OFICIAL (OUTUBRO/2026)</w:t>
+      </w:r>
+    </w:p>
+    <w:p>
+      <w:pPr>
+        <w:spacing w:before="40" w:after="60" w:line="276" w:lineRule="auto"/>
+        <w:ind w:left="288"/>
+      </w:pPr>
+      <w:r>
+        <w:rPr>
+          <w:rFonts w:ascii="Calibri" w:hAnsi="Calibri"/>
+          <w:color w:val="0A0A0C"/>
+          <w:sz w:val="20"/>
+        </w:rPr>
+        <w:t>* Domínio Oficial e E-mails: Domínio netfits.com.br registrado com e-mails corporativos (andre@, contato@, dpo@, parceiros@, financeiro@).</w:t>
+      </w:r>
+    </w:p>
+    <w:p>
+      <w:pPr>
+        <w:spacing w:before="40" w:after="60" w:line="276" w:lineRule="auto"/>
+        <w:ind w:left="288"/>
+      </w:pPr>
+      <w:r>
+        <w:rPr>
+          <w:rFonts w:ascii="Calibri" w:hAnsi="Calibri"/>
+          <w:color w:val="0A0A0C"/>
+          <w:sz w:val="20"/>
+        </w:rPr>
+        <w:t>* Marketplace Integrado com Checkout do Parceiro: Na Fase 1, todo o checkout, processamento e cadastramento de sellers é centralizado no parceiro integrador; a Netfits apura mensalmente 8,0% de Take-Rate e emite NFS-e contra o parceiro sob CNAE 82.99-7-99 em Santana de Parnaíba.</w:t>
+      </w:r>
+    </w:p>
+    <w:p>
+      <w:pPr>
+        <w:spacing w:before="40" w:after="60" w:line="276" w:lineRule="auto"/>
+        <w:ind w:left="288"/>
+      </w:pPr>
+      <w:r>
+        <w:rPr>
+          <w:rFonts w:ascii="Calibri" w:hAnsi="Calibri"/>
+          <w:color w:val="0A0A0C"/>
+          <w:sz w:val="20"/>
+        </w:rPr>
+        <w:t>* Grupo Piloto de 10 Associados VIP (Janeiro/2027): Entrada planejada de apenas 10 profissionais de alta influência para validação do Rev Share de 10%.</w:t>
+      </w:r>
+    </w:p>
+    <w:p>
+      <w:pPr>
+        <w:spacing w:before="40" w:after="60" w:line="276" w:lineRule="auto"/>
+        <w:ind w:left="288"/>
+      </w:pPr>
+      <w:r>
+        <w:rPr>
+          <w:rFonts w:ascii="Calibri" w:hAnsi="Calibri"/>
+          <w:color w:val="0A0A0C"/>
+          <w:sz w:val="20"/>
+        </w:rPr>
+        <w:t>* Wearables &amp; Netfits Club na Fase 2: Integração via SDK com Apple HealthKit, Google Health Connect e Garmin reservada para a Fase 2 conjuntamente com o lançamento do Clube de Assinaturas (R$ 19,90/mês).</w:t>
+      </w:r>
+    </w:p>
     <w:sectPr>
       <w:footerReference w:type="default" r:id="rId9"/>
       <w:pgSz w:w="12240" w:h="15840"/>

</xml_diff>